<commit_message>
logo fond mis à jour
</commit_message>
<xml_diff>
--- a/DA V2.docx
+++ b/DA V2.docx
@@ -58,7 +58,7 @@
     </w:p>
     <w:p>
       <w:r>
-        <w:pict w14:anchorId="1F311798">
+        <w:pict w14:anchorId="782D708E">
           <v:rect id="_x0000_i1149" style="width:0;height:1.5pt" o:hralign="center" o:hrstd="t" o:hr="t" fillcolor="#a0a0a0" stroked="f"/>
         </w:pict>
       </w:r>
@@ -118,7 +118,7 @@
     </w:p>
     <w:p>
       <w:r>
-        <w:pict w14:anchorId="3962E86D">
+        <w:pict w14:anchorId="0243E968">
           <v:rect id="_x0000_i1150" style="width:0;height:1.5pt" o:hralign="center" o:hrstd="t" o:hr="t" fillcolor="#a0a0a0" stroked="f"/>
         </w:pict>
       </w:r>
@@ -153,7 +153,7 @@
     </w:p>
     <w:p>
       <w:r>
-        <w:pict w14:anchorId="227B7F02">
+        <w:pict w14:anchorId="025DEAF7">
           <v:rect id="_x0000_i1151" style="width:0;height:1.5pt" o:hralign="center" o:hrstd="t" o:hr="t" fillcolor="#a0a0a0" stroked="f"/>
         </w:pict>
       </w:r>
@@ -184,7 +184,7 @@
     </w:p>
     <w:p>
       <w:r>
-        <w:pict w14:anchorId="76C4284B">
+        <w:pict w14:anchorId="680BB157">
           <v:rect id="_x0000_i1152" style="width:0;height:1.5pt" o:hralign="center" o:hrstd="t" o:hr="t" fillcolor="#a0a0a0" stroked="f"/>
         </w:pict>
       </w:r>
@@ -248,7 +248,7 @@
     <w:p>
       <w:r>
         <w:lastRenderedPageBreak/>
-        <w:pict w14:anchorId="5E4ACAC4">
+        <w:pict w14:anchorId="239F3C81">
           <v:rect id="_x0000_i1153" style="width:0;height:1.5pt" o:hralign="center" o:hrstd="t" o:hr="t" fillcolor="#a0a0a0" stroked="f"/>
         </w:pict>
       </w:r>
@@ -293,7 +293,7 @@
     </w:p>
     <w:p>
       <w:r>
-        <w:pict w14:anchorId="7651B56A">
+        <w:pict w14:anchorId="2EE0F443">
           <v:rect id="_x0000_i1154" style="width:0;height:1.5pt" o:hralign="center" o:hrstd="t" o:hr="t" fillcolor="#a0a0a0" stroked="f"/>
         </w:pict>
       </w:r>
@@ -339,7 +339,7 @@
     </w:p>
     <w:p>
       <w:r>
-        <w:pict w14:anchorId="37A99925">
+        <w:pict w14:anchorId="07076830">
           <v:rect id="_x0000_i1155" style="width:0;height:1.5pt" o:hralign="center" o:hrstd="t" o:hr="t" fillcolor="#a0a0a0" stroked="f"/>
         </w:pict>
       </w:r>
@@ -357,10 +357,10 @@
           <w:bCs/>
         </w:rPr>
         <w:drawing>
-          <wp:inline distT="0" distB="0" distL="0" distR="0" wp14:anchorId="0065012E" wp14:editId="63B2C848">
+          <wp:inline distT="0" distB="0" distL="0" distR="0" wp14:anchorId="4234B59B" wp14:editId="1C89C410">
             <wp:extent cx="304800" cy="304800"/>
             <wp:effectExtent l="0" t="0" r="0" b="0"/>
-            <wp:docPr id="267215447" name="Image 8" descr="🌿"/>
+            <wp:docPr id="1665321634" name="Image 8" descr="🌿"/>
             <wp:cNvGraphicFramePr>
               <a:graphicFrameLocks xmlns:a="http://schemas.openxmlformats.org/drawingml/2006/main" noChangeAspect="1"/>
             </wp:cNvGraphicFramePr>
@@ -415,7 +415,7 @@
     </w:p>
     <w:p>
       <w:r>
-        <w:pict w14:anchorId="3DEAE1EE">
+        <w:pict w14:anchorId="7B27CFAD">
           <v:rect id="_x0000_i1157" style="width:0;height:1.5pt" o:hralign="center" o:hrstd="t" o:hr="t" fillcolor="#a0a0a0" stroked="f"/>
         </w:pict>
       </w:r>
@@ -489,7 +489,7 @@
     </w:p>
     <w:p>
       <w:r>
-        <w:pict w14:anchorId="76EA4558">
+        <w:pict w14:anchorId="41570DEB">
           <v:rect id="_x0000_i1158" style="width:0;height:1.5pt" o:hralign="center" o:hrstd="t" o:hr="t" fillcolor="#a0a0a0" stroked="f"/>
         </w:pict>
       </w:r>
@@ -526,7 +526,7 @@
     </w:p>
     <w:p>
       <w:r>
-        <w:pict w14:anchorId="1473400D">
+        <w:pict w14:anchorId="43BDC3C4">
           <v:rect id="_x0000_i1159" style="width:0;height:1.5pt" o:hralign="center" o:hrstd="t" o:hr="t" fillcolor="#a0a0a0" stroked="f"/>
         </w:pict>
       </w:r>
@@ -544,10 +544,10 @@
           <w:bCs/>
         </w:rPr>
         <w:drawing>
-          <wp:inline distT="0" distB="0" distL="0" distR="0" wp14:anchorId="246CE899" wp14:editId="509B6512">
+          <wp:inline distT="0" distB="0" distL="0" distR="0" wp14:anchorId="620C1669" wp14:editId="10F8001D">
             <wp:extent cx="304800" cy="304800"/>
             <wp:effectExtent l="0" t="0" r="0" b="0"/>
-            <wp:docPr id="2125094489" name="Image 7" descr="🌿"/>
+            <wp:docPr id="1234445671" name="Image 7" descr="🌿"/>
             <wp:cNvGraphicFramePr>
               <a:graphicFrameLocks xmlns:a="http://schemas.openxmlformats.org/drawingml/2006/main" noChangeAspect="1"/>
             </wp:cNvGraphicFramePr>
@@ -630,7 +630,7 @@
     </w:p>
     <w:p>
       <w:r>
-        <w:pict w14:anchorId="01240011">
+        <w:pict w14:anchorId="04C49CAE">
           <v:rect id="_x0000_i1161" style="width:0;height:1.5pt" o:hralign="center" o:hrstd="t" o:hr="t" fillcolor="#a0a0a0" stroked="f"/>
         </w:pict>
       </w:r>
@@ -665,7 +665,7 @@
     </w:p>
     <w:p>
       <w:r>
-        <w:pict w14:anchorId="5D232E6B">
+        <w:pict w14:anchorId="05BB6D39">
           <v:rect id="_x0000_i1162" style="width:0;height:1.5pt" o:hralign="center" o:hrstd="t" o:hr="t" fillcolor="#a0a0a0" stroked="f"/>
         </w:pict>
       </w:r>
@@ -683,10 +683,10 @@
           <w:bCs/>
         </w:rPr>
         <w:drawing>
-          <wp:inline distT="0" distB="0" distL="0" distR="0" wp14:anchorId="29B89916" wp14:editId="1D9B7E57">
+          <wp:inline distT="0" distB="0" distL="0" distR="0" wp14:anchorId="0259C50E" wp14:editId="6234A1E3">
             <wp:extent cx="304800" cy="304800"/>
             <wp:effectExtent l="0" t="0" r="0" b="0"/>
-            <wp:docPr id="1141699950" name="Image 6" descr="🌿"/>
+            <wp:docPr id="227603807" name="Image 6" descr="🌿"/>
             <wp:cNvGraphicFramePr>
               <a:graphicFrameLocks xmlns:a="http://schemas.openxmlformats.org/drawingml/2006/main" noChangeAspect="1"/>
             </wp:cNvGraphicFramePr>
@@ -763,7 +763,7 @@
     </w:p>
     <w:p>
       <w:r>
-        <w:pict w14:anchorId="29D5BA9C">
+        <w:pict w14:anchorId="48E9570B">
           <v:rect id="_x0000_i1164" style="width:0;height:1.5pt" o:hralign="center" o:hrstd="t" o:hr="t" fillcolor="#a0a0a0" stroked="f"/>
         </w:pict>
       </w:r>
@@ -781,10 +781,10 @@
           <w:bCs/>
         </w:rPr>
         <w:drawing>
-          <wp:inline distT="0" distB="0" distL="0" distR="0" wp14:anchorId="0764AF71" wp14:editId="4206FD99">
+          <wp:inline distT="0" distB="0" distL="0" distR="0" wp14:anchorId="3ABD1A3D" wp14:editId="47F34738">
             <wp:extent cx="304800" cy="304800"/>
             <wp:effectExtent l="0" t="0" r="0" b="0"/>
-            <wp:docPr id="1402373203" name="Image 5" descr="🌿"/>
+            <wp:docPr id="389430888" name="Image 5" descr="🌿"/>
             <wp:cNvGraphicFramePr>
               <a:graphicFrameLocks xmlns:a="http://schemas.openxmlformats.org/drawingml/2006/main" noChangeAspect="1"/>
             </wp:cNvGraphicFramePr>

</xml_diff>